<commit_message>
feat: restructure investment memo export with cover page, metadata tables, and detailed valuation assumptions
</commit_message>
<xml_diff>
--- a/Investment_Memo_SUN_NS.docx
+++ b/Investment_Memo_SUN_NS.docx
@@ -2,6 +2,11 @@
 <file path=word/document.xml><?xml version="1.0" encoding="utf-8"?>
 <w:document xmlns:wpc="http://schemas.microsoft.com/office/word/2010/wordprocessingCanvas" xmlns:mo="http://schemas.microsoft.com/office/mac/office/2008/main" xmlns:mc="http://schemas.openxmlformats.org/markup-compatibility/2006" xmlns:mv="urn:schemas-microsoft-com:mac:vml" xmlns:o="urn:schemas-microsoft-com:office:office" xmlns:r="http://schemas.openxmlformats.org/officeDocument/2006/relationships" xmlns:m="http://schemas.openxmlformats.org/officeDocument/2006/math" xmlns:v="urn:schemas-microsoft-com:vml" xmlns:wp14="http://schemas.microsoft.com/office/word/2010/wordprocessingDrawing" xmlns:wp="http://schemas.openxmlformats.org/drawingml/2006/wordprocessingDrawing" xmlns:w10="urn:schemas-microsoft-com:office:word" xmlns:w="http://schemas.openxmlformats.org/wordprocessingml/2006/main" xmlns:w14="http://schemas.microsoft.com/office/word/2010/wordml" xmlns:wpg="http://schemas.microsoft.com/office/word/2010/wordprocessingGroup" xmlns:wpi="http://schemas.microsoft.com/office/word/2010/wordprocessingInk" xmlns:wne="http://schemas.microsoft.com/office/word/2006/wordml" xmlns:wps="http://schemas.microsoft.com/office/word/2010/wordprocessingShape" mc:Ignorable="w14 wp14">
   <w:body>
+    <w:p>
+      <w:pPr>
+        <w:spacing w:before="2000"/>
+      </w:pPr>
+    </w:p>
     <w:p>
       <w:pPr>
         <w:pStyle w:val="Title"/>
@@ -12,13 +17,182 @@
       </w:r>
     </w:p>
     <w:p>
+      <w:pPr>
+        <w:jc w:val="center"/>
+      </w:pPr>
       <w:r>
-        <w:t>Ticker: SUN.NS | Sector: Pharmaceuticals | Analyst: Bijesh Singha</w:t>
+        <w:rPr>
+          <w:b/>
+          <w:color w:val="64748B"/>
+          <w:sz w:val="28"/>
+        </w:rPr>
+        <w:t>FUNDAMENTAL VALUATION &amp; STOCHASTIC ANALYSIS</w:t>
       </w:r>
     </w:p>
     <w:p>
+      <w:pPr>
+        <w:spacing w:after="2400"/>
+      </w:pPr>
+    </w:p>
+    <w:tbl>
+      <w:tblPr>
+        <w:tblW w:type="auto" w:w="0"/>
+        <w:jc w:val="center"/>
+        <w:tblLook w:firstColumn="1" w:firstRow="1" w:lastColumn="0" w:lastRow="0" w:noHBand="0" w:noVBand="1" w:val="04A0"/>
+      </w:tblPr>
+      <w:tblGrid>
+        <w:gridCol w:w="4320"/>
+        <w:gridCol w:w="4320"/>
+      </w:tblGrid>
+      <w:tr>
+        <w:tc>
+          <w:tcPr>
+            <w:tcW w:type="dxa" w:w="4320"/>
+          </w:tcPr>
+          <w:p>
+            <w:r>
+              <w:rPr>
+                <w:b/>
+                <w:sz w:val="22"/>
+              </w:rPr>
+              <w:t>Target Entity:</w:t>
+            </w:r>
+          </w:p>
+        </w:tc>
+        <w:tc>
+          <w:tcPr>
+            <w:tcW w:type="dxa" w:w="4320"/>
+          </w:tcPr>
+          <w:p>
+            <w:r>
+              <w:rPr>
+                <w:sz w:val="22"/>
+              </w:rPr>
+              <w:t>Sun Pharmaceutical Industries Ltd. (NSE: SUN.NS)</w:t>
+            </w:r>
+          </w:p>
+        </w:tc>
+      </w:tr>
+      <w:tr>
+        <w:tc>
+          <w:tcPr>
+            <w:tcW w:type="dxa" w:w="4320"/>
+          </w:tcPr>
+          <w:p>
+            <w:r>
+              <w:rPr>
+                <w:b/>
+                <w:sz w:val="22"/>
+              </w:rPr>
+              <w:t>Sector / Industry:</w:t>
+            </w:r>
+          </w:p>
+        </w:tc>
+        <w:tc>
+          <w:tcPr>
+            <w:tcW w:type="dxa" w:w="4320"/>
+          </w:tcPr>
+          <w:p>
+            <w:r>
+              <w:rPr>
+                <w:sz w:val="22"/>
+              </w:rPr>
+              <w:t>Indian Pharmaceuticals (Nifty Pharma Index)</w:t>
+            </w:r>
+          </w:p>
+        </w:tc>
+      </w:tr>
+      <w:tr>
+        <w:tc>
+          <w:tcPr>
+            <w:tcW w:type="dxa" w:w="4320"/>
+          </w:tcPr>
+          <w:p>
+            <w:r>
+              <w:rPr>
+                <w:b/>
+                <w:sz w:val="22"/>
+              </w:rPr>
+              <w:t>Lead Valuation Analyst:</w:t>
+            </w:r>
+          </w:p>
+        </w:tc>
+        <w:tc>
+          <w:tcPr>
+            <w:tcW w:type="dxa" w:w="4320"/>
+          </w:tcPr>
+          <w:p>
+            <w:r>
+              <w:rPr>
+                <w:sz w:val="22"/>
+              </w:rPr>
+              <w:t>Bijesh Singha</w:t>
+            </w:r>
+          </w:p>
+        </w:tc>
+      </w:tr>
+      <w:tr>
+        <w:tc>
+          <w:tcPr>
+            <w:tcW w:type="dxa" w:w="4320"/>
+          </w:tcPr>
+          <w:p>
+            <w:r>
+              <w:rPr>
+                <w:b/>
+                <w:sz w:val="22"/>
+              </w:rPr>
+              <w:t>Valuation Date:</w:t>
+            </w:r>
+          </w:p>
+        </w:tc>
+        <w:tc>
+          <w:tcPr>
+            <w:tcW w:type="dxa" w:w="4320"/>
+          </w:tcPr>
+          <w:p>
+            <w:r>
+              <w:rPr>
+                <w:sz w:val="22"/>
+              </w:rPr>
+              <w:t>July 2026</w:t>
+            </w:r>
+          </w:p>
+        </w:tc>
+      </w:tr>
+      <w:tr>
+        <w:tc>
+          <w:tcPr>
+            <w:tcW w:type="dxa" w:w="4320"/>
+          </w:tcPr>
+          <w:p>
+            <w:r>
+              <w:rPr>
+                <w:b/>
+                <w:sz w:val="22"/>
+              </w:rPr>
+              <w:t>Document Classification:</w:t>
+            </w:r>
+          </w:p>
+        </w:tc>
+        <w:tc>
+          <w:tcPr>
+            <w:tcW w:type="dxa" w:w="4320"/>
+          </w:tcPr>
+          <w:p>
+            <w:r>
+              <w:rPr>
+                <w:sz w:val="22"/>
+              </w:rPr>
+              <w:t>CONFIDENTIAL - INSTITUTIONAL RESEARCH ONLY</w:t>
+            </w:r>
+          </w:p>
+        </w:tc>
+      </w:tr>
+    </w:tbl>
+    <w:p>
       <w:r>
-        <w:t>______________________________________________________________________</w:t>
+        <w:br w:type="page"/>
       </w:r>
     </w:p>
     <w:p>
@@ -26,37 +200,212 @@
         <w:pStyle w:val="Heading1"/>
       </w:pPr>
       <w:r>
-        <w:t>EXECUTIVE SUMMARY</w:t>
+        <w:t>1. EXECUTIVE SUMMARY</w:t>
       </w:r>
     </w:p>
     <w:p>
+      <w:pPr>
+        <w:spacing w:before="120"/>
+      </w:pPr>
       <w:r>
         <w:rPr>
           <w:b/>
         </w:rPr>
-        <w:t xml:space="preserve">RECOMMENDATION: </w:t>
+        <w:t xml:space="preserve">INVESTMENT RECOMMENDATION: </w:t>
       </w:r>
       <w:r>
         <w:rPr>
           <w:b/>
-          <w:color w:val="FF0000"/>
+          <w:color w:val="DC2626"/>
+          <w:sz w:val="26"/>
         </w:rPr>
         <w:t>SELL / UNDERWEIGHT</w:t>
       </w:r>
     </w:p>
     <w:p>
       <w:r>
-        <w:t>Current Market Price: ₹1,868</w:t>
+        <w:t>Based on our deterministic Driver-Based Discounted Cash Flow (DCF) model and 10,000-iteration Monte Carlo stochastic simulation, Sun Pharmaceutical Industries (SUN.NS) is currently trading at a severe premium relative to its underlying cash-generative capacity.</w:t>
+      </w:r>
+    </w:p>
+    <w:tbl>
+      <w:tblPr>
+        <w:tblW w:type="auto" w:w="0"/>
+        <w:jc w:val="center"/>
+        <w:tblLook w:firstColumn="1" w:firstRow="1" w:lastColumn="0" w:lastRow="0" w:noHBand="0" w:noVBand="1" w:val="04A0"/>
+      </w:tblPr>
+      <w:tblGrid>
+        <w:gridCol w:w="4320"/>
+        <w:gridCol w:w="4320"/>
+      </w:tblGrid>
+      <w:tr>
+        <w:tc>
+          <w:tcPr>
+            <w:tcW w:type="dxa" w:w="4320"/>
+            <w:shd w:fill="1E293B"/>
+          </w:tcPr>
+          <w:p>
+            <w:r>
+              <w:rPr>
+                <w:b/>
+                <w:color w:val="FFFFFF"/>
+              </w:rPr>
+              <w:t>Valuation Metric</w:t>
+            </w:r>
+          </w:p>
+        </w:tc>
+        <w:tc>
+          <w:tcPr>
+            <w:tcW w:type="dxa" w:w="4320"/>
+            <w:shd w:fill="1E293B"/>
+          </w:tcPr>
+          <w:p>
+            <w:r>
+              <w:rPr>
+                <w:b/>
+                <w:color w:val="FFFFFF"/>
+              </w:rPr>
+              <w:t>Value (INR / Share)</w:t>
+            </w:r>
+          </w:p>
+        </w:tc>
+      </w:tr>
+      <w:tr>
+        <w:tc>
+          <w:tcPr>
+            <w:tcW w:type="dxa" w:w="4320"/>
+          </w:tcPr>
+          <w:p>
+            <w:r>
+              <w:t>Current Market Trading Price</w:t>
+            </w:r>
+          </w:p>
+        </w:tc>
+        <w:tc>
+          <w:tcPr>
+            <w:tcW w:type="dxa" w:w="4320"/>
+          </w:tcPr>
+          <w:p>
+            <w:r>
+              <w:t>₹1,868.00</w:t>
+            </w:r>
+          </w:p>
+        </w:tc>
+      </w:tr>
+      <w:tr>
+        <w:tc>
+          <w:tcPr>
+            <w:tcW w:type="dxa" w:w="4320"/>
+          </w:tcPr>
+          <w:p>
+            <w:r>
+              <w:rPr>
+                <w:b/>
+              </w:rPr>
+              <w:t>Base Case DCF Intrinsic Value (50th Percentile)</w:t>
+            </w:r>
+          </w:p>
+        </w:tc>
+        <w:tc>
+          <w:tcPr>
+            <w:tcW w:type="dxa" w:w="4320"/>
+          </w:tcPr>
+          <w:p>
+            <w:r>
+              <w:rPr>
+                <w:b/>
+                <w:color w:val="DC2626"/>
+              </w:rPr>
+              <w:t>₹887.87</w:t>
+            </w:r>
+          </w:p>
+        </w:tc>
+      </w:tr>
+      <w:tr>
+        <w:tc>
+          <w:tcPr>
+            <w:tcW w:type="dxa" w:w="4320"/>
+          </w:tcPr>
+          <w:p>
+            <w:r>
+              <w:t>Implied Target Downside</w:t>
+            </w:r>
+          </w:p>
+        </w:tc>
+        <w:tc>
+          <w:tcPr>
+            <w:tcW w:type="dxa" w:w="4320"/>
+          </w:tcPr>
+          <w:p>
+            <w:r>
+              <w:t>-52.47%</w:t>
+            </w:r>
+          </w:p>
+        </w:tc>
+      </w:tr>
+      <w:tr>
+        <w:tc>
+          <w:tcPr>
+            <w:tcW w:type="dxa" w:w="4320"/>
+          </w:tcPr>
+          <w:p>
+            <w:r>
+              <w:t>Bear Case Stress Value (10th Percentile)</w:t>
+            </w:r>
+          </w:p>
+        </w:tc>
+        <w:tc>
+          <w:tcPr>
+            <w:tcW w:type="dxa" w:w="4320"/>
+          </w:tcPr>
+          <w:p>
+            <w:r>
+              <w:t>₹780.22</w:t>
+            </w:r>
+          </w:p>
+        </w:tc>
+      </w:tr>
+      <w:tr>
+        <w:tc>
+          <w:tcPr>
+            <w:tcW w:type="dxa" w:w="4320"/>
+          </w:tcPr>
+          <w:p>
+            <w:r>
+              <w:t>Bull Case Stress Value (90th Percentile)</w:t>
+            </w:r>
+          </w:p>
+        </w:tc>
+        <w:tc>
+          <w:tcPr>
+            <w:tcW w:type="dxa" w:w="4320"/>
+          </w:tcPr>
+          <w:p>
+            <w:r>
+              <w:t>₹1,006.34</w:t>
+            </w:r>
+          </w:p>
+        </w:tc>
+      </w:tr>
+    </w:tbl>
+    <w:p>
+      <w:pPr>
+        <w:pStyle w:val="Heading2"/>
+      </w:pPr>
+      <w:r>
+        <w:t>Core Investment Thesis</w:t>
       </w:r>
     </w:p>
     <w:p>
       <w:r>
-        <w:t>Base Case Target Price: ₹888</w:t>
+        <w:t xml:space="preserve">While Sun Pharma exhibits stable top-line expansion (~10% CAGR) and robust EBIT operating margins (~23%), the required capital reinvestment rate—specifically the Working Capital drag and maintenance Capital Expenditures required to sustain pharmaceutical supply chains—absorbs approximately 30% of operating profits. </w:t>
+      </w:r>
+      <w:r>
+        <w:t>The live equity market is pricing Sun Pharma for absolute operational perfection, completely ignoring the balance sheet reinvestment burden required to support future revenue growth.</w:t>
       </w:r>
     </w:p>
     <w:p>
       <w:r>
-        <w:t>Implied Downside: -52.4%</w:t>
+        <w:br w:type="page"/>
       </w:r>
     </w:p>
     <w:p>
@@ -64,12 +413,515 @@
         <w:pStyle w:val="Heading1"/>
       </w:pPr>
       <w:r>
-        <w:t>CORE THESIS</w:t>
+        <w:t>2. COMPLETE VALUATION ASSUMPTIONS &amp; PARAMETERS</w:t>
       </w:r>
     </w:p>
     <w:p>
       <w:r>
-        <w:t>While top-line growth and margins remain stable, the required reinvestment rate (working capital and CapEx) severely restricts Free Cash Flow generation. The broader market is currently ignoring the balance sheet drag and pricing the stock for absolute perfection.</w:t>
+        <w:t>To ensure full mathematical transparency and institutional auditability, every parameter, proxy, and macroeconomic assumption utilized across our deterministic and stochastic modeling engines is detailed below.</w:t>
+      </w:r>
+    </w:p>
+    <w:p>
+      <w:pPr>
+        <w:pStyle w:val="Heading2"/>
+      </w:pPr>
+      <w:r>
+        <w:t>2.1 Macroeconomic &amp; Cost of Capital (WACC) Assumptions</w:t>
+      </w:r>
+    </w:p>
+    <w:tbl>
+      <w:tblPr>
+        <w:tblW w:type="auto" w:w="0"/>
+        <w:tblLook w:firstColumn="1" w:firstRow="1" w:lastColumn="0" w:lastRow="0" w:noHBand="0" w:noVBand="1" w:val="04A0"/>
+      </w:tblPr>
+      <w:tblGrid>
+        <w:gridCol w:w="2880"/>
+        <w:gridCol w:w="2880"/>
+        <w:gridCol w:w="2880"/>
+      </w:tblGrid>
+      <w:tr>
+        <w:tc>
+          <w:tcPr>
+            <w:tcW w:type="dxa" w:w="2880"/>
+            <w:shd w:fill="334155"/>
+          </w:tcPr>
+          <w:p>
+            <w:r>
+              <w:rPr>
+                <w:b/>
+                <w:color w:val="FFFFFF"/>
+              </w:rPr>
+              <w:t>Parameter</w:t>
+            </w:r>
+          </w:p>
+        </w:tc>
+        <w:tc>
+          <w:tcPr>
+            <w:tcW w:type="dxa" w:w="2880"/>
+            <w:shd w:fill="334155"/>
+          </w:tcPr>
+          <w:p>
+            <w:r>
+              <w:rPr>
+                <w:b/>
+                <w:color w:val="FFFFFF"/>
+              </w:rPr>
+              <w:t>Assumed Value</w:t>
+            </w:r>
+          </w:p>
+        </w:tc>
+        <w:tc>
+          <w:tcPr>
+            <w:tcW w:type="dxa" w:w="2880"/>
+            <w:shd w:fill="334155"/>
+          </w:tcPr>
+          <w:p>
+            <w:r>
+              <w:rPr>
+                <w:b/>
+                <w:color w:val="FFFFFF"/>
+              </w:rPr>
+              <w:t>Financial Rationale &amp; Source</w:t>
+            </w:r>
+          </w:p>
+        </w:tc>
+      </w:tr>
+      <w:tr>
+        <w:tc>
+          <w:tcPr>
+            <w:tcW w:type="dxa" w:w="2880"/>
+          </w:tcPr>
+          <w:p>
+            <w:r>
+              <w:t>Risk-Free Rate (Rf)</w:t>
+            </w:r>
+          </w:p>
+        </w:tc>
+        <w:tc>
+          <w:tcPr>
+            <w:tcW w:type="dxa" w:w="2880"/>
+          </w:tcPr>
+          <w:p>
+            <w:r>
+              <w:t>7.00%</w:t>
+            </w:r>
+          </w:p>
+        </w:tc>
+        <w:tc>
+          <w:tcPr>
+            <w:tcW w:type="dxa" w:w="2880"/>
+          </w:tcPr>
+          <w:p>
+            <w:r>
+              <w:t>Benchmark India 10-Year Government Bond Yield.</w:t>
+            </w:r>
+          </w:p>
+        </w:tc>
+      </w:tr>
+      <w:tr>
+        <w:tc>
+          <w:tcPr>
+            <w:tcW w:type="dxa" w:w="2880"/>
+          </w:tcPr>
+          <w:p>
+            <w:r>
+              <w:t>Equity Risk Premium (ERP)</w:t>
+            </w:r>
+          </w:p>
+        </w:tc>
+        <w:tc>
+          <w:tcPr>
+            <w:tcW w:type="dxa" w:w="2880"/>
+          </w:tcPr>
+          <w:p>
+            <w:r>
+              <w:t>6.00%</w:t>
+            </w:r>
+          </w:p>
+        </w:tc>
+        <w:tc>
+          <w:tcPr>
+            <w:tcW w:type="dxa" w:w="2880"/>
+          </w:tcPr>
+          <w:p>
+            <w:r>
+              <w:t>Consensus long-term equity risk premium for Indian equity markets.</w:t>
+            </w:r>
+          </w:p>
+        </w:tc>
+      </w:tr>
+      <w:tr>
+        <w:tc>
+          <w:tcPr>
+            <w:tcW w:type="dxa" w:w="2880"/>
+          </w:tcPr>
+          <w:p>
+            <w:r>
+              <w:t>Equity Beta (β)</w:t>
+            </w:r>
+          </w:p>
+        </w:tc>
+        <w:tc>
+          <w:tcPr>
+            <w:tcW w:type="dxa" w:w="2880"/>
+          </w:tcPr>
+          <w:p>
+            <w:r>
+              <w:t>0.75</w:t>
+            </w:r>
+          </w:p>
+        </w:tc>
+        <w:tc>
+          <w:tcPr>
+            <w:tcW w:type="dxa" w:w="2880"/>
+          </w:tcPr>
+          <w:p>
+            <w:r>
+              <w:t>LSEG live extraction or defensive proxy beta for large-cap pharmaceuticals.</w:t>
+            </w:r>
+          </w:p>
+        </w:tc>
+      </w:tr>
+      <w:tr>
+        <w:tc>
+          <w:tcPr>
+            <w:tcW w:type="dxa" w:w="2880"/>
+          </w:tcPr>
+          <w:p>
+            <w:r>
+              <w:t>Cost of Debt (Pre-Tax Rd)</w:t>
+            </w:r>
+          </w:p>
+        </w:tc>
+        <w:tc>
+          <w:tcPr>
+            <w:tcW w:type="dxa" w:w="2880"/>
+          </w:tcPr>
+          <w:p>
+            <w:r>
+              <w:t>8.00%</w:t>
+            </w:r>
+          </w:p>
+        </w:tc>
+        <w:tc>
+          <w:tcPr>
+            <w:tcW w:type="dxa" w:w="2880"/>
+          </w:tcPr>
+          <w:p>
+            <w:r>
+              <w:t>Annualized quarterly interest expense divided by total debt outstanding.</w:t>
+            </w:r>
+          </w:p>
+        </w:tc>
+      </w:tr>
+      <w:tr>
+        <w:tc>
+          <w:tcPr>
+            <w:tcW w:type="dxa" w:w="2880"/>
+          </w:tcPr>
+          <w:p>
+            <w:r>
+              <w:t>Effective Corporate Tax Rate (Tc)</w:t>
+            </w:r>
+          </w:p>
+        </w:tc>
+        <w:tc>
+          <w:tcPr>
+            <w:tcW w:type="dxa" w:w="2880"/>
+          </w:tcPr>
+          <w:p>
+            <w:r>
+              <w:t>25.00%</w:t>
+            </w:r>
+          </w:p>
+        </w:tc>
+        <w:tc>
+          <w:tcPr>
+            <w:tcW w:type="dxa" w:w="2880"/>
+          </w:tcPr>
+          <w:p>
+            <w:r>
+              <w:t>Normalized statutory Indian corporate tax rate proxy.</w:t>
+            </w:r>
+          </w:p>
+        </w:tc>
+      </w:tr>
+      <w:tr>
+        <w:tc>
+          <w:tcPr>
+            <w:tcW w:type="dxa" w:w="2880"/>
+          </w:tcPr>
+          <w:p>
+            <w:r>
+              <w:t>Calculated WACC</w:t>
+            </w:r>
+          </w:p>
+        </w:tc>
+        <w:tc>
+          <w:tcPr>
+            <w:tcW w:type="dxa" w:w="2880"/>
+          </w:tcPr>
+          <w:p>
+            <w:r>
+              <w:t>11.45%</w:t>
+            </w:r>
+          </w:p>
+        </w:tc>
+        <w:tc>
+          <w:tcPr>
+            <w:tcW w:type="dxa" w:w="2880"/>
+          </w:tcPr>
+          <w:p>
+            <w:r>
+              <w:t>Dynamic weighted blend based on live E/V and D/V capital structure.</w:t>
+            </w:r>
+          </w:p>
+        </w:tc>
+      </w:tr>
+    </w:tbl>
+    <w:p>
+      <w:pPr>
+        <w:pStyle w:val="Heading2"/>
+      </w:pPr>
+      <w:r>
+        <w:t>2.2 Base Case Deterministic 5-Year Forecast Drivers</w:t>
+      </w:r>
+    </w:p>
+    <w:tbl>
+      <w:tblPr>
+        <w:tblW w:type="auto" w:w="0"/>
+        <w:tblLook w:firstColumn="1" w:firstRow="1" w:lastColumn="0" w:lastRow="0" w:noHBand="0" w:noVBand="1" w:val="04A0"/>
+      </w:tblPr>
+      <w:tblGrid>
+        <w:gridCol w:w="2880"/>
+        <w:gridCol w:w="2880"/>
+        <w:gridCol w:w="2880"/>
+      </w:tblGrid>
+      <w:tr>
+        <w:tc>
+          <w:tcPr>
+            <w:tcW w:type="dxa" w:w="2880"/>
+            <w:shd w:fill="334155"/>
+          </w:tcPr>
+          <w:p>
+            <w:r>
+              <w:rPr>
+                <w:b/>
+                <w:color w:val="FFFFFF"/>
+              </w:rPr>
+              <w:t>Forecast Driver</w:t>
+            </w:r>
+          </w:p>
+        </w:tc>
+        <w:tc>
+          <w:tcPr>
+            <w:tcW w:type="dxa" w:w="2880"/>
+            <w:shd w:fill="334155"/>
+          </w:tcPr>
+          <w:p>
+            <w:r>
+              <w:rPr>
+                <w:b/>
+                <w:color w:val="FFFFFF"/>
+              </w:rPr>
+              <w:t>Baseline Parameter</w:t>
+            </w:r>
+          </w:p>
+        </w:tc>
+        <w:tc>
+          <w:tcPr>
+            <w:tcW w:type="dxa" w:w="2880"/>
+            <w:shd w:fill="334155"/>
+          </w:tcPr>
+          <w:p>
+            <w:r>
+              <w:rPr>
+                <w:b/>
+                <w:color w:val="FFFFFF"/>
+              </w:rPr>
+              <w:t>Operational Justification</w:t>
+            </w:r>
+          </w:p>
+        </w:tc>
+      </w:tr>
+      <w:tr>
+        <w:tc>
+          <w:tcPr>
+            <w:tcW w:type="dxa" w:w="2880"/>
+          </w:tcPr>
+          <w:p>
+            <w:r>
+              <w:t>Baseline Revenue (Year 0)</w:t>
+            </w:r>
+          </w:p>
+        </w:tc>
+        <w:tc>
+          <w:tcPr>
+            <w:tcW w:type="dxa" w:w="2880"/>
+          </w:tcPr>
+          <w:p>
+            <w:r>
+              <w:t>₹450,000 Million</w:t>
+            </w:r>
+          </w:p>
+        </w:tc>
+        <w:tc>
+          <w:tcPr>
+            <w:tcW w:type="dxa" w:w="2880"/>
+          </w:tcPr>
+          <w:p>
+            <w:r>
+              <w:t>Normalized trailing historical base revenue established in Phase 2.</w:t>
+            </w:r>
+          </w:p>
+        </w:tc>
+      </w:tr>
+      <w:tr>
+        <w:tc>
+          <w:tcPr>
+            <w:tcW w:type="dxa" w:w="2880"/>
+          </w:tcPr>
+          <w:p>
+            <w:r>
+              <w:t>Top-Line Revenue Growth Rate</w:t>
+            </w:r>
+          </w:p>
+        </w:tc>
+        <w:tc>
+          <w:tcPr>
+            <w:tcW w:type="dxa" w:w="2880"/>
+          </w:tcPr>
+          <w:p>
+            <w:r>
+              <w:t>10.00% p.a.</w:t>
+            </w:r>
+          </w:p>
+        </w:tc>
+        <w:tc>
+          <w:tcPr>
+            <w:tcW w:type="dxa" w:w="2880"/>
+          </w:tcPr>
+          <w:p>
+            <w:r>
+              <w:t>Historical industry growth ceiling for large-cap mature pharma manufacturers.</w:t>
+            </w:r>
+          </w:p>
+        </w:tc>
+      </w:tr>
+      <w:tr>
+        <w:tc>
+          <w:tcPr>
+            <w:tcW w:type="dxa" w:w="2880"/>
+          </w:tcPr>
+          <w:p>
+            <w:r>
+              <w:t>Operating Profit Margin (EBIT)</w:t>
+            </w:r>
+          </w:p>
+        </w:tc>
+        <w:tc>
+          <w:tcPr>
+            <w:tcW w:type="dxa" w:w="2880"/>
+          </w:tcPr>
+          <w:p>
+            <w:r>
+              <w:t>23.00%</w:t>
+            </w:r>
+          </w:p>
+        </w:tc>
+        <w:tc>
+          <w:tcPr>
+            <w:tcW w:type="dxa" w:w="2880"/>
+          </w:tcPr>
+          <w:p>
+            <w:r>
+              <w:t>Verified operating margin efficiency derived from historical financial statements.</w:t>
+            </w:r>
+          </w:p>
+        </w:tc>
+      </w:tr>
+      <w:tr>
+        <w:tc>
+          <w:tcPr>
+            <w:tcW w:type="dxa" w:w="2880"/>
+          </w:tcPr>
+          <w:p>
+            <w:r>
+              <w:t>Reinvestment Rate (CapEx + NWC)</w:t>
+            </w:r>
+          </w:p>
+        </w:tc>
+        <w:tc>
+          <w:tcPr>
+            <w:tcW w:type="dxa" w:w="2880"/>
+          </w:tcPr>
+          <w:p>
+            <w:r>
+              <w:t>30.00% of EBIT</w:t>
+            </w:r>
+          </w:p>
+        </w:tc>
+        <w:tc>
+          <w:tcPr>
+            <w:tcW w:type="dxa" w:w="2880"/>
+          </w:tcPr>
+          <w:p>
+            <w:r>
+              <w:t>Capital required to maintain physical plants and fund inventory/receivables.</w:t>
+            </w:r>
+          </w:p>
+        </w:tc>
+      </w:tr>
+    </w:tbl>
+    <w:p>
+      <w:pPr>
+        <w:pStyle w:val="Heading2"/>
+      </w:pPr>
+      <w:r>
+        <w:t>2.3 Terminal Valuation Assumptions</w:t>
+      </w:r>
+    </w:p>
+    <w:p>
+      <w:r>
+        <w:t>• Perpetual Gordon Growth Rate (g): 5.00% (Reflects long-term Indian nominal GDP growth ceiling).</w:t>
+      </w:r>
+    </w:p>
+    <w:p>
+      <w:r>
+        <w:t>• Terminal Year Reinvestment: Assumed to normalize in perpetuity as reinvestment matches depreciation.</w:t>
+      </w:r>
+    </w:p>
+    <w:p>
+      <w:pPr>
+        <w:pStyle w:val="Heading2"/>
+      </w:pPr>
+      <w:r>
+        <w:t>2.4 Stochastic Monte Carlo Simulation Parameters</w:t>
+      </w:r>
+    </w:p>
+    <w:p>
+      <w:r>
+        <w:t>• Simulation Iterations: 10,000 independent randomized trials.</w:t>
+      </w:r>
+    </w:p>
+    <w:p>
+      <w:r>
+        <w:t>• Revenue Growth Distribution: Normal Distribution | Mean = 10.0% | Standard Deviation = 2.0%.</w:t>
+      </w:r>
+    </w:p>
+    <w:p>
+      <w:r>
+        <w:t>• EBIT Margin Distribution: Normal Distribution | Mean = 23.0% | Standard Deviation = 1.5%.</w:t>
+      </w:r>
+    </w:p>
+    <w:p>
+      <w:r>
+        <w:t>• Net Working Capital Drag Mechanics: Programmatically coupled to top-line revenue expansion to penalize artificial cash inflation.</w:t>
+      </w:r>
+    </w:p>
+    <w:p>
+      <w:r>
+        <w:br w:type="page"/>
       </w:r>
     </w:p>
     <w:p>
@@ -77,27 +929,27 @@
         <w:pStyle w:val="Heading1"/>
       </w:pPr>
       <w:r>
-        <w:t>QUANTITATIVE FINDINGS (MONTE CARLO)</w:t>
+        <w:t>3. MONTE CARLO STOCHASTIC FINDINGS</w:t>
       </w:r>
     </w:p>
     <w:p>
       <w:r>
-        <w:t>We ran a 10,000-iteration stochastic simulation stressing Revenue Growth (Mean: 10%, Std Dev: 2%) and EBIT Margins (Mean: 23%, Std Dev: 1.5%), mathematically penalizing free cash flows with an automated Net Working Capital drag.</w:t>
+        <w:t>Stochastic stress testing confirms that even across 10,000 iterations simulating potential market upside and operating outperformance, Sun Pharma fails to reach current market trading levels:</w:t>
       </w:r>
     </w:p>
     <w:p>
       <w:r>
-        <w:t>• Bull Case (90th Percentile): ₹1,006</w:t>
+        <w:t>• 90th Percentile (Bull Case): ₹1,006.34 per share</w:t>
       </w:r>
     </w:p>
     <w:p>
       <w:r>
-        <w:t>• Base Case (50th Percentile): ₹888</w:t>
+        <w:t>• 50th Percentile (Base Case): ₹887.87 per share</w:t>
       </w:r>
     </w:p>
     <w:p>
       <w:r>
-        <w:t>• Bear Case (10th Percentile): ₹780</w:t>
+        <w:t>• 10th Percentile (Bear Case): ₹780.22 per share</w:t>
       </w:r>
     </w:p>
     <w:p>
@@ -105,12 +957,17 @@
         <w:pStyle w:val="Heading1"/>
       </w:pPr>
       <w:r>
-        <w:t>REVERSE DCF (MARKET DELUSION)</w:t>
+        <w:t>4. REVERSE DCF: THE MARKET DELUSION</w:t>
       </w:r>
     </w:p>
     <w:p>
       <w:r>
-        <w:t>To mathematically justify the current trading price of ₹1,868, Sun Pharma would have to sustain a compound annual revenue growth rate of 37.3% every single year for the next 5 years. Because Sun Pharma is a mature, large-cap pharmaceutical giant that historically tops out at ~12% growth, the market's implied expectation is physically impossible to achieve.</w:t>
+        <w:t>To mathematically justify the current trading price of ₹1,868 under our verified WACC (11.45%) and margin framework (23%), Sun Pharma would have to achieve a Compound Annual Growth Rate (CAGR) of 37.3% every single year for the next 5 years.</w:t>
+      </w:r>
+    </w:p>
+    <w:p>
+      <w:r>
+        <w:t>Because Sun Pharma is a ₹1.8+ Trillion market-cap incumbent whose historical organic growth ceiling averages ~10-12%, the market's implied expectation of 37.3% continuous growth is physically and structurally impossible to execute.</w:t>
       </w:r>
     </w:p>
     <w:p>
@@ -123,7 +980,7 @@
         <w:jc w:val="center"/>
       </w:pPr>
       <w:r>
-        <w:t>CONFIDENTIAL - FOR INTERNAL DISTRIBUTION ONLY</w:t>
+        <w:t>CONFIDENTIAL - FOR INSTITUTIONAL DISTRIBUTION ONLY</w:t>
       </w:r>
     </w:p>
     <w:sectPr>

</xml_diff>